<commit_message>
Refresh companion paper PDF/docx (corpus now 2,044)
Co-Authored-By: Claude Opus 4.8 <noreply@anthropic.com>
</commit_message>
<xml_diff>
--- a/papers/Gerszten-Reactive-Literature.docx
+++ b/papers/Gerszten-Reactive-Literature.docx
@@ -106,7 +106,7 @@
           <w:sz w:val="21"/>
           <w:szCs w:val="21"/>
         </w:rPr>
-        <w:t xml:space="preserve">Does legal scholarship on bank regulation influence policy, or merely comment on it? This paper assembles an original corpus of 1,915 banking-law review articles (2000–2025) and links it to the federal policy record through free government data, in order to measure influence rather than assume it. The answer is stratified. In the aggregate, the literature is reactive: scholarly output tracks policy events at a two-to-three-year lag, and the topics that dominate the field—Dodd-Frank, crisis programs, Basel III—surge after the events that produced them, not before. But a small, identifiable vanguard sits upstream of policy, and its influence is visible across three independent channels: citation of specific articles in congressional and judicial documents, recurring expert testimony, and movement into government office. The paper documents both the reactive baseline and the upstream exceptions, develops a reproducible and license-respecting method for the linkage, and is deliberate about what “influence” can and cannot be shown. A companion interactive dashboard and a Bluebook-formatted citation dataset accompany the study.</w:t>
+        <w:t xml:space="preserve">Does legal scholarship on bank regulation influence policy, or merely comment on it? This paper assembles an original corpus of 2,044 banking-law review articles (2000–2025) and links it to the federal policy record through free government data, in order to measure influence rather than assume it. The answer is stratified. In the aggregate, the literature is reactive: scholarly output tracks policy events at a two-to-three-year lag, and the topics that dominate the field—Dodd-Frank, crisis programs, Basel III—surge after the events that produced them, not before. But a small, identifiable vanguard sits upstream of policy, and its influence is visible across three independent channels: citation of specific articles in congressional and judicial documents, recurring expert testimony, and movement into government office. The paper documents both the reactive baseline and the upstream exceptions, develops a reproducible and license-respecting method for the linkage, and is deliberate about what “influence” can and cannot be shown. A companion interactive dashboard and a Bluebook-formatted citation dataset accompany the study.</w:t>
       </w:r>
     </w:p>
     <w:p>
@@ -294,7 +294,7 @@
           <w:i w:val="false"/>
           <w:iCs w:val="false"/>
         </w:rPr>
-        <w:t xml:space="preserve">The corpus comprises 1,915 banking-relevant articles published 2000–2025, filtered from roughly 8,400 deduplicated law-review records drawn from some 384 sources. The records were assembled exclusively from </w:t>
+        <w:t xml:space="preserve">The corpus comprises 2,044 banking-relevant articles published 2000–2025, filtered from roughly 8,500 deduplicated law-review records drawn from some 384 sources. The records were assembled exclusively from </w:t>
       </w:r>
       <w:r>
         <w:rPr>
@@ -450,7 +450,7 @@
           <w:i w:val="false"/>
           <w:iCs w:val="false"/>
         </w:rPr>
-        <w:t xml:space="preserve">: every record carries a citation built from its journal of record—never SSRN or a repository. Of 1,915 records, 1,326 (69%) have a complete citation (author, title, volume, journal, first page, year); 341 have a known journal but pending volume or page; and 248 (13%) are flagged for manual completion because their published venue cannot be recovered from open sources alone. Flagging the residual, rather than mislabeling it, keeps the dataset honest.</w:t>
+        <w:t xml:space="preserve">: every record carries a citation built from its journal of record—never SSRN or a repository. Of 2,044 records, 1,329 (69%) have a complete citation (author, title, volume, journal, first page, year); 341 have a known journal but pending volume or page; and 224 (11%) are flagged for manual completion because their published venue cannot be recovered from open sources alone. Flagging the residual, rather than mislabeling it, keeps the dataset honest.</w:t>
       </w:r>
     </w:p>
     <w:p>
@@ -1838,7 +1838,7 @@
           <w:i/>
           <w:iCs/>
         </w:rPr>
-        <w:t xml:space="preserve">Twelve of seventeen</w:t>
+        <w:t xml:space="preserve">Thirteen of eighteen</w:t>
       </w:r>
       <w:r>
         <w:rPr>
@@ -1871,7 +1871,7 @@
           <w:i w:val="false"/>
           <w:iCs w:val="false"/>
         </w:rPr>
-        <w:t xml:space="preserve"> (r ≈ 0.43): scholarly output correlates most strongly with the policy events of two to three years earlier. Both analyses point the same way. In the aggregate, the literature follows policy.</w:t>
+        <w:t xml:space="preserve"> (r ≈ 0.44): scholarly output correlates most strongly with the policy events of two to three years earlier. Both analyses point the same way. In the aggregate, the literature follows policy.</w:t>
       </w:r>
     </w:p>
     <w:p>
@@ -2489,7 +2489,7 @@
           <w:i w:val="false"/>
           <w:iCs w:val="false"/>
         </w:rPr>
-        <w:t xml:space="preserve"> Approximately 1,915 banking-relevant articles (2000–2025), a 30-topic taxonomy, and 1,477 authors, assembled from open, terms-of-service-respecting sources only. </w:t>
+        <w:t xml:space="preserve"> Approximately 2,044 banking-relevant articles (2000–2025), a 30-topic taxonomy, and 1,477 authors, assembled from open, terms-of-service-respecting sources only. </w:t>
       </w:r>
       <w:r>
         <w:rPr>
@@ -2503,7 +2503,7 @@
           <w:i w:val="false"/>
           <w:iCs w:val="false"/>
         </w:rPr>
-        <w:t xml:space="preserve"> 1,326 complete citations, 341 journal-only, and 248 flagged for manual completion; the journal of record is never SSRN or a repository. </w:t>
+        <w:t xml:space="preserve"> 1,329 complete citations, 491 journal-only, and 224 flagged for manual completion; the journal of record is never SSRN or a repository. </w:t>
       </w:r>
       <w:r>
         <w:rPr>

</xml_diff>

<commit_message>
Ingest 34 recovered 'Other'-bucket pieces + cite-scan new pieces; corpus now 2,078
Recovered 34 banking articles the rule classifier had mislabeled as out-of-scope;
folded in + citation-scanned. Corpus 2,044 -> 2,078; cited-in-federal-docs 152 -> 174.
Refreshed data + companion paper (PDF/docx).

Co-Authored-By: Claude Opus 4.8 <noreply@anthropic.com>
</commit_message>
<xml_diff>
--- a/papers/Gerszten-Reactive-Literature.docx
+++ b/papers/Gerszten-Reactive-Literature.docx
@@ -106,7 +106,7 @@
           <w:sz w:val="21"/>
           <w:szCs w:val="21"/>
         </w:rPr>
-        <w:t xml:space="preserve">Does legal scholarship on bank regulation influence policy, or merely comment on it? This paper assembles an original corpus of 2,044 banking-law review articles (2000–2025) and links it to the federal policy record through free government data, in order to measure influence rather than assume it. The answer is stratified. In the aggregate, the literature is reactive: scholarly output tracks policy events at a two-to-three-year lag, and the topics that dominate the field—Dodd-Frank, crisis programs, Basel III—surge after the events that produced them, not before. But a small, identifiable vanguard sits upstream of policy, and its influence is visible across three independent channels: citation of specific articles in congressional and judicial documents, recurring expert testimony, and movement into government office. The paper documents both the reactive baseline and the upstream exceptions, develops a reproducible and license-respecting method for the linkage, and is deliberate about what “influence” can and cannot be shown. A companion interactive dashboard and a Bluebook-formatted citation dataset accompany the study.</w:t>
+        <w:t xml:space="preserve">Does legal scholarship on bank regulation influence policy, or merely comment on it? This paper assembles an original corpus of 2,078 banking-law review articles (2000–2025) and links it to the federal policy record through free government data, in order to measure influence rather than assume it. The answer is stratified. In the aggregate, the literature is reactive: scholarly output tracks policy events at a two-to-three-year lag, and the topics that dominate the field—Dodd-Frank, crisis programs, Basel III—surge after the events that produced them, not before. But a small, identifiable vanguard sits upstream of policy, and its influence is visible across three independent channels: citation of specific articles in congressional and judicial documents, recurring expert testimony, and movement into government office. The paper documents both the reactive baseline and the upstream exceptions, develops a reproducible and license-respecting method for the linkage, and is deliberate about what “influence” can and cannot be shown. A companion interactive dashboard and a Bluebook-formatted citation dataset accompany the study.</w:t>
       </w:r>
     </w:p>
     <w:p>
@@ -294,7 +294,7 @@
           <w:i w:val="false"/>
           <w:iCs w:val="false"/>
         </w:rPr>
-        <w:t xml:space="preserve">The corpus comprises 2,044 banking-relevant articles published 2000–2025, filtered from roughly 8,500 deduplicated law-review records drawn from some 384 sources. The records were assembled exclusively from </w:t>
+        <w:t xml:space="preserve">The corpus comprises 2,078 banking-relevant articles published 2000–2025, filtered from roughly 8,500 deduplicated law-review records drawn from some 384 sources. The records were assembled exclusively from </w:t>
       </w:r>
       <w:r>
         <w:rPr>
@@ -450,7 +450,7 @@
           <w:i w:val="false"/>
           <w:iCs w:val="false"/>
         </w:rPr>
-        <w:t xml:space="preserve">: every record carries a citation built from its journal of record—never SSRN or a repository. Of 2,044 records, 1,329 (69%) have a complete citation (author, title, volume, journal, first page, year); 341 have a known journal but pending volume or page; and 224 (11%) are flagged for manual completion because their published venue cannot be recovered from open sources alone. Flagging the residual, rather than mislabeling it, keeps the dataset honest.</w:t>
+        <w:t xml:space="preserve">: every record carries a citation built from its journal of record—never SSRN or a repository. Of 2,078 records, 1,329 (64%) have a complete citation (author, title, volume, journal, first page, year); 515 have a known journal but pending volume or page; and 234 (11%) are flagged for manual completion because their published venue cannot be recovered from open sources alone. Flagging the residual, rather than mislabeling it, keeps the dataset honest.</w:t>
       </w:r>
     </w:p>
     <w:p>
@@ -1871,7 +1871,7 @@
           <w:i w:val="false"/>
           <w:iCs w:val="false"/>
         </w:rPr>
-        <w:t xml:space="preserve"> (r ≈ 0.44): scholarly output correlates most strongly with the policy events of two to three years earlier. Both analyses point the same way. In the aggregate, the literature follows policy.</w:t>
+        <w:t xml:space="preserve"> (r ≈ 0.46): scholarly output correlates most strongly with the policy events of two to three years earlier. Both analyses point the same way. In the aggregate, the literature follows policy.</w:t>
       </w:r>
     </w:p>
     <w:p>
@@ -1970,7 +1970,7 @@
           <w:i w:val="false"/>
           <w:iCs w:val="false"/>
         </w:rPr>
-        <w:t xml:space="preserve">. (Two recall corrections—handling parenthetical subtitles and short distinctive titles—raised the confirmed count from 105 to 152.) Of 1,764 distinctively-titled articles, 152 (about 9%) are cited by exact title in at least one federal document: roughly 74 with a congressional citation (the high-confidence core), 62 with a federal-court citation (noisier, given common surnames), and 16 in the Federal Register or CFR. Confirmed examples include Frank Partnoy’s credit-rating-agency scholarship appearing in the very hearing convened on rating-agency regulation and in the Senate’s </w:t>
+        <w:t xml:space="preserve">. (Two recall corrections—handling parenthetical subtitles and short distinctive titles—raised the confirmed count from 105 to 152; later corpus additions brought it to 174.) Of 1,917 distinctively-titled articles, 174 (about 9%) are cited by exact title in at least one federal document: roughly 85 with a congressional citation (the high-confidence core), 74 with a federal-court citation (noisier, given common surnames), and 17 in the Federal Register or CFR. Confirmed examples include Frank Partnoy’s credit-rating-agency scholarship appearing in the very hearing convened on rating-agency regulation and in the Senate’s </w:t>
       </w:r>
       <w:r>
         <w:rPr>
@@ -2489,7 +2489,7 @@
           <w:i w:val="false"/>
           <w:iCs w:val="false"/>
         </w:rPr>
-        <w:t xml:space="preserve"> Approximately 2,044 banking-relevant articles (2000–2025), a 30-topic taxonomy, and 1,477 authors, assembled from open, terms-of-service-respecting sources only. </w:t>
+        <w:t xml:space="preserve"> Approximately 2,078 banking-relevant articles (2000–2025), a 30-topic taxonomy, and 1,477 authors, assembled from open, terms-of-service-respecting sources only. </w:t>
       </w:r>
       <w:r>
         <w:rPr>
@@ -2503,7 +2503,7 @@
           <w:i w:val="false"/>
           <w:iCs w:val="false"/>
         </w:rPr>
-        <w:t xml:space="preserve"> 1,329 complete citations, 491 journal-only, and 224 flagged for manual completion; the journal of record is never SSRN or a repository. </w:t>
+        <w:t xml:space="preserve"> 1,329 complete citations, 515 journal-only, and 234 flagged for manual completion; the journal of record is never SSRN or a repository. </w:t>
       </w:r>
       <w:r>
         <w:rPr>

</xml_diff>

<commit_message>
Update paper + data: reporter-form citation scan (174->202 cited pieces)
Co-Authored-By: Claude Opus 4.8 <noreply@anthropic.com>
</commit_message>
<xml_diff>
--- a/papers/Gerszten-Reactive-Literature.docx
+++ b/papers/Gerszten-Reactive-Literature.docx
@@ -1942,7 +1942,7 @@
           <w:i w:val="false"/>
           <w:iCs w:val="false"/>
         </w:rPr>
-        <w:t xml:space="preserve">Articles were matched to federal documents by an </w:t>
+        <w:t xml:space="preserve">Articles were matched to federal documents two ways: an </w:t>
       </w:r>
       <w:r>
         <w:rPr>
@@ -1956,7 +1956,21 @@
           <w:i w:val="false"/>
           <w:iCs w:val="false"/>
         </w:rPr>
-        <w:t xml:space="preserve">—a high-precision rule that eliminates generic-phrase false positives. The method is precise but recall-limited: it captures verbatim-title references, not citations that use only a Bluebook abbreviation, so the counts are </w:t>
+        <w:t xml:space="preserve"> (a high-precision rule that eliminates generic-phrase false positives), and </w:t>
+      </w:r>
+      <w:r>
+        <w:rPr>
+          <w:i/>
+          <w:iCs/>
+        </w:rPr>
+        <w:t xml:space="preserve">Bluebook reporter-form matching</w:t>
+      </w:r>
+      <w:r>
+        <w:rPr>
+          <w:i w:val="false"/>
+          <w:iCs w:val="false"/>
+        </w:rPr>
+        <w:t xml:space="preserve">—searching for the citation string itself (“97 Cornell L. Rev. 1141”), which is even more distinctive because a volume-journal-page triple points to exactly one article. The method is precise but recall-limited, so the counts are </w:t>
       </w:r>
       <w:r>
         <w:rPr>
@@ -1970,7 +1984,7 @@
           <w:i w:val="false"/>
           <w:iCs w:val="false"/>
         </w:rPr>
-        <w:t xml:space="preserve">. (Two recall corrections—handling parenthetical subtitles and short distinctive titles—raised the confirmed count from 105 to 152; later corpus additions brought it to 174.) Of 1,917 distinctively-titled articles, 174 (about 9%) are cited by exact title in at least one federal document: roughly 85 with a congressional citation (the high-confidence core), 74 with a federal-court citation (noisier, given common surnames), and 17 in the Federal Register or CFR. Confirmed examples include Frank Partnoy’s credit-rating-agency scholarship appearing in the very hearing convened on rating-agency regulation and in the Senate’s </w:t>
+        <w:t xml:space="preserve">. (Successive recall corrections raised the confirmed count from 105 to 152 to 174 as parenthetical subtitles, short distinctive titles, and corpus additions were handled; adding reporter-form matching brought it to 202.) Of the distinctively-titled and reporter-citeable articles, 202 (about 10%) are cited in at least one federal document: 90 with a congressional citation (the high-confidence core), 97 with a federal-court citation (the reporter-form pass added most of these, since opinions cite in reporter form), and 17 in the Federal Register or CFR. Confirmed examples include Frank Partnoy’s credit-rating-agency scholarship appearing in the very hearing convened on rating-agency regulation and in the Senate’s </w:t>
       </w:r>
       <w:r>
         <w:rPr>

</xml_diff>

<commit_message>
Remove SSRN as displayed venue: resolve 21 to journal of record via OpenAlex, blank the rest
- SSRN Electronic Journal no longer appears as a venue anywhere (was 41 refs in data.js)
- 21 SSRN-scraped articles resolved to real journal + Bluebook cite (Stanford, Texas, Nw., etc.)
- Bluebook dataset: 1,340 full / 513 journal-only / 225 flagged

Co-Authored-By: Claude Opus 4.8 <noreply@anthropic.com>
</commit_message>
<xml_diff>
--- a/papers/Gerszten-Reactive-Literature.docx
+++ b/papers/Gerszten-Reactive-Literature.docx
@@ -436,7 +436,7 @@
           <w:i w:val="false"/>
           <w:iCs w:val="false"/>
         </w:rPr>
-        <w:t xml:space="preserve">To fix this, a journal-of-record pass parses each repository landing page’s citation metadata and re-attributes the piece to its journal of publication. The result feeds a </w:t>
+        <w:t xml:space="preserve">To fix this, a journal-of-record pass parses each repository landing page’s citation metadata and re-attributes the piece to its journal of publication; a second pass resolves records scraped from SSRN by reading the journal and pagination from OpenAlex's per-work location metadata. The result feeds a </w:t>
       </w:r>
       <w:r>
         <w:rPr>
@@ -450,7 +450,7 @@
           <w:i w:val="false"/>
           <w:iCs w:val="false"/>
         </w:rPr>
-        <w:t xml:space="preserve">: every record carries a citation built from its journal of record—never SSRN or a repository. Of 2,078 records, 1,329 (64%) have a complete citation (author, title, volume, journal, first page, year); 515 have a known journal but pending volume or page; and 234 (11%) are flagged for manual completion because their published venue cannot be recovered from open sources alone. Flagging the residual, rather than mislabeling it, keeps the dataset honest.</w:t>
+        <w:t xml:space="preserve">: every record carries a citation built from its journal of record—never SSRN or a repository. Of 2,078 records, 1,340 (64%) have a complete citation (author, title, volume, journal, first page, year); 513 have a known journal but pending volume or page; and 225 (11%) are flagged for manual completion because their published venue cannot be recovered from open sources alone (many are forthcoming pieces with no journal of record yet). Flagging the residual, rather than mislabeling it, keeps the dataset honest.</w:t>
       </w:r>
     </w:p>
     <w:p>
@@ -2427,7 +2427,7 @@
           <w:i w:val="false"/>
           <w:iCs w:val="false"/>
         </w:rPr>
-        <w:t xml:space="preserve">: about 13% of records lack a journal of record recoverable from open sources and are flagged rather than guessed.</w:t>
+        <w:t xml:space="preserve">: about 11% of records lack a journal of record recoverable from open sources and are flagged rather than guessed.</w:t>
       </w:r>
     </w:p>
     <w:p>
@@ -2517,7 +2517,7 @@
           <w:i w:val="false"/>
           <w:iCs w:val="false"/>
         </w:rPr>
-        <w:t xml:space="preserve"> 1,329 complete citations, 515 journal-only, and 234 flagged for manual completion; the journal of record is never SSRN or a repository. </w:t>
+        <w:t xml:space="preserve"> 1,340 complete citations, 513 journal-only, and 225 flagged for manual completion; the journal of record is never SSRN or a repository. </w:t>
       </w:r>
       <w:r>
         <w:rPr>

</xml_diff>

<commit_message>
Remove ALL repository names as venues (not just SSRN)
- Re-ran bepress Recommended-Citation attribution over current corpus: +53 journals recovered
- eYLS/Faculty Scholarship/Faculty Publications/Presentations/Books no longer shown as venues
- School labels cleaned (Yale, Harvard, Columbia — no repo jargon in parentheticals)
- Fixed source typos (George Washington L. Rev.) and citation-fragment venue names
- Bluebook: 1,340 full / 556 journal-only / 182 flagged

Co-Authored-By: Claude Opus 4.8 <noreply@anthropic.com>
</commit_message>
<xml_diff>
--- a/papers/Gerszten-Reactive-Literature.docx
+++ b/papers/Gerszten-Reactive-Literature.docx
@@ -450,7 +450,7 @@
           <w:i w:val="false"/>
           <w:iCs w:val="false"/>
         </w:rPr>
-        <w:t xml:space="preserve">: every record carries a citation built from its journal of record—never SSRN or a repository. Of 2,078 records, 1,340 (64%) have a complete citation (author, title, volume, journal, first page, year); 513 have a known journal but pending volume or page; and 225 (11%) are flagged for manual completion because their published venue cannot be recovered from open sources alone (many are forthcoming pieces with no journal of record yet). Flagging the residual, rather than mislabeling it, keeps the dataset honest.</w:t>
+        <w:t xml:space="preserve">: every record carries a citation built from its journal of record—never SSRN or a repository. Of 2,078 records, 1,340 (64%) have a complete citation (author, title, volume, journal, first page, year); 556 have a known journal but pending volume or page; and 182 (9%) are flagged for manual completion because their published venue cannot be recovered from open sources alone (many are forthcoming pieces with no journal of record yet). Flagging the residual, rather than mislabeling it, keeps the dataset honest.</w:t>
       </w:r>
     </w:p>
     <w:p>
@@ -2427,7 +2427,7 @@
           <w:i w:val="false"/>
           <w:iCs w:val="false"/>
         </w:rPr>
-        <w:t xml:space="preserve">: about 11% of records lack a journal of record recoverable from open sources and are flagged rather than guessed.</w:t>
+        <w:t xml:space="preserve">: about 9% of records lack a journal of record recoverable from open sources and are flagged rather than guessed.</w:t>
       </w:r>
     </w:p>
     <w:p>
@@ -2517,7 +2517,7 @@
           <w:i w:val="false"/>
           <w:iCs w:val="false"/>
         </w:rPr>
-        <w:t xml:space="preserve"> 1,340 complete citations, 513 journal-only, and 225 flagged for manual completion; the journal of record is never SSRN or a repository. </w:t>
+        <w:t xml:space="preserve"> 1,340 complete citations, 556 journal-only, and 182 flagged for manual completion; the journal of record is never SSRN or a repository. </w:t>
       </w:r>
       <w:r>
         <w:rPr>

</xml_diff>